<commit_message>
1,2,3,4,5,7, 9 updated. 6, 8 left
</commit_message>
<xml_diff>
--- a/Working Folder/4 Raymond Mok 莫健儿 - Cycle of Destiny 圆来缘去/4_Front-Matter.docx
+++ b/Working Folder/4 Raymond Mok 莫健儿 - Cycle of Destiny 圆来缘去/4_Front-Matter.docx
@@ -2622,7 +2622,14 @@
           <w:rFonts w:ascii="Noto Serif SC" w:eastAsia="Noto Serif SC" w:hAnsi="Noto Serif SC" w:cs="Noto Serif"/>
           <w:lang w:val="en-US"/>
         </w:rPr>
-        <w:t xml:space="preserve">5 </w:t>
+        <w:t>4</w:t>
+      </w:r>
+      <w:r>
+        <w:rPr>
+          <w:rFonts w:ascii="Noto Serif SC" w:eastAsia="Noto Serif SC" w:hAnsi="Noto Serif SC" w:cs="Noto Serif"/>
+          <w:lang w:val="en-US"/>
+        </w:rPr>
+        <w:t xml:space="preserve"> </w:t>
       </w:r>
       <w:r>
         <w:rPr>
@@ -2665,15 +2672,7 @@
           <w:szCs w:val="18"/>
           <w:lang w:val="en-US"/>
         </w:rPr>
-        <w:t xml:space="preserve">: </w:t>
-      </w:r>
-      <w:r>
-        <w:rPr>
-          <w:rFonts w:ascii="Noto Serif SC" w:eastAsia="Noto Serif SC" w:hAnsi="Noto Serif SC" w:cs="Noto Serif"/>
-          <w:sz w:val="18"/>
-          <w:szCs w:val="18"/>
-        </w:rPr>
-        <w:t>中国大鼓</w:t>
+        <w:t>:</w:t>
       </w:r>
       <w:r>
         <w:rPr>
@@ -2684,6 +2683,54 @@
         </w:rPr>
         <w:t xml:space="preserve"> </w:t>
       </w:r>
+      <w:r>
+        <w:rPr>
+          <w:rFonts w:ascii="Noto Serif SC" w:eastAsia="Noto Serif SC" w:hAnsi="Noto Serif SC" w:cs="Noto Serif"/>
+          <w:sz w:val="18"/>
+          <w:szCs w:val="18"/>
+        </w:rPr>
+        <w:t>三角铁 Triangle</w:t>
+      </w:r>
+      <w:r>
+        <w:rPr>
+          <w:rFonts w:ascii="Noto Serif SC" w:eastAsia="Noto Serif SC" w:hAnsi="Noto Serif SC" w:cs="Noto Serif"/>
+          <w:sz w:val="18"/>
+          <w:szCs w:val="18"/>
+        </w:rPr>
+        <w:t xml:space="preserve">, </w:t>
+      </w:r>
+      <w:r>
+        <w:rPr>
+          <w:rFonts w:ascii="Noto Serif SC" w:eastAsia="Noto Serif SC" w:hAnsi="Noto Serif SC" w:cs="Noto Serif"/>
+          <w:sz w:val="18"/>
+          <w:szCs w:val="18"/>
+        </w:rPr>
+        <w:t xml:space="preserve"> </w:t>
+      </w:r>
+      <w:r>
+        <w:rPr>
+          <w:rFonts w:ascii="Noto Serif SC" w:eastAsia="Noto Serif SC" w:hAnsi="Noto Serif SC" w:cs="Noto Serif"/>
+          <w:sz w:val="18"/>
+          <w:szCs w:val="18"/>
+        </w:rPr>
+        <w:t>马铃 Sleighbells</w:t>
+      </w:r>
+      <w:r>
+        <w:rPr>
+          <w:rFonts w:ascii="Noto Serif SC" w:eastAsia="Noto Serif SC" w:hAnsi="Noto Serif SC" w:cs="Noto Serif"/>
+          <w:sz w:val="18"/>
+          <w:szCs w:val="18"/>
+        </w:rPr>
+        <w:t xml:space="preserve">, </w:t>
+      </w:r>
+      <w:r>
+        <w:rPr>
+          <w:rFonts w:ascii="Noto Serif SC" w:eastAsia="Noto Serif SC" w:hAnsi="Noto Serif SC" w:cs="Noto Serif"/>
+          <w:sz w:val="18"/>
+          <w:szCs w:val="18"/>
+        </w:rPr>
+        <w:t xml:space="preserve">小锣 </w:t>
+      </w:r>
       <w:proofErr w:type="spellStart"/>
       <w:r>
         <w:rPr>
@@ -2691,7 +2738,7 @@
           <w:sz w:val="18"/>
           <w:szCs w:val="18"/>
         </w:rPr>
-        <w:t>Zhongguo</w:t>
+        <w:t>Xiaoluo</w:t>
       </w:r>
       <w:proofErr w:type="spellEnd"/>
       <w:r>
@@ -2700,7 +2747,73 @@
           <w:sz w:val="18"/>
           <w:szCs w:val="18"/>
         </w:rPr>
-        <w:t xml:space="preserve"> Dagu </w:t>
+        <w:t xml:space="preserve">, </w:t>
+      </w:r>
+      <w:r>
+        <w:rPr>
+          <w:rFonts w:ascii="Noto Serif SC" w:eastAsia="Noto Serif SC" w:hAnsi="Noto Serif SC" w:cs="Noto Serif" w:hint="eastAsia"/>
+          <w:sz w:val="18"/>
+          <w:szCs w:val="18"/>
+        </w:rPr>
+        <w:t>吊钹 Suspended Cymbal</w:t>
+      </w:r>
+      <w:r>
+        <w:rPr>
+          <w:rFonts w:ascii="Noto Serif SC" w:eastAsia="Noto Serif SC" w:hAnsi="Noto Serif SC" w:cs="Noto Serif"/>
+          <w:sz w:val="18"/>
+          <w:szCs w:val="18"/>
+        </w:rPr>
+        <w:t xml:space="preserve">, </w:t>
+      </w:r>
+      <w:r>
+        <w:rPr>
+          <w:rFonts w:ascii="Noto Serif SC" w:eastAsia="Noto Serif SC" w:hAnsi="Noto Serif SC" w:cs="Noto Serif"/>
+          <w:sz w:val="18"/>
+          <w:szCs w:val="18"/>
+        </w:rPr>
+        <w:t>钢片琴 Glockenspiel</w:t>
+      </w:r>
+      <w:r>
+        <w:rPr>
+          <w:rFonts w:ascii="Noto Serif SC" w:eastAsia="Noto Serif SC" w:hAnsi="Noto Serif SC" w:cs="Noto Serif"/>
+          <w:sz w:val="18"/>
+          <w:szCs w:val="18"/>
+        </w:rPr>
+        <w:t xml:space="preserve">, </w:t>
+      </w:r>
+      <w:r>
+        <w:rPr>
+          <w:rFonts w:ascii="Noto Serif SC" w:eastAsia="Noto Serif SC" w:hAnsi="Noto Serif SC" w:cs="Noto Serif"/>
+          <w:sz w:val="18"/>
+          <w:szCs w:val="18"/>
+        </w:rPr>
+        <w:t xml:space="preserve">小京钹 </w:t>
+      </w:r>
+      <w:proofErr w:type="spellStart"/>
+      <w:r>
+        <w:rPr>
+          <w:rFonts w:ascii="Noto Serif SC" w:eastAsia="Noto Serif SC" w:hAnsi="Noto Serif SC" w:cs="Noto Serif"/>
+          <w:sz w:val="18"/>
+          <w:szCs w:val="18"/>
+        </w:rPr>
+        <w:t>Xiaojingbo</w:t>
+      </w:r>
+      <w:proofErr w:type="spellEnd"/>
+      <w:r>
+        <w:rPr>
+          <w:rFonts w:ascii="Noto Serif SC" w:eastAsia="Noto Serif SC" w:hAnsi="Noto Serif SC" w:cs="Noto Serif"/>
+          <w:sz w:val="18"/>
+          <w:szCs w:val="18"/>
+        </w:rPr>
+        <w:t xml:space="preserve">, </w:t>
+      </w:r>
+      <w:r>
+        <w:rPr>
+          <w:rFonts w:ascii="Noto Serif SC" w:eastAsia="Noto Serif SC" w:hAnsi="Noto Serif SC" w:cs="Noto Serif"/>
+          <w:sz w:val="18"/>
+          <w:szCs w:val="18"/>
+        </w:rPr>
+        <w:t>小藏磬 Small Tibetan Singing Bowl</w:t>
       </w:r>
     </w:p>
     <w:p>
@@ -2720,15 +2833,24 @@
           <w:szCs w:val="18"/>
           <w:lang w:val="en-US"/>
         </w:rPr>
-        <w:t xml:space="preserve">II: </w:t>
-      </w:r>
-      <w:r>
-        <w:rPr>
-          <w:rFonts w:ascii="Noto Serif SC" w:eastAsia="Noto Serif SC" w:hAnsi="Noto Serif SC" w:cs="Noto Serif"/>
-          <w:sz w:val="18"/>
-          <w:szCs w:val="18"/>
-        </w:rPr>
-        <w:t>排鼓</w:t>
+        <w:t>II:</w:t>
+      </w:r>
+      <w:r>
+        <w:rPr>
+          <w:rFonts w:ascii="Noto Serif SC" w:eastAsia="Noto Serif SC" w:hAnsi="Noto Serif SC" w:cs="Noto Serif"/>
+          <w:sz w:val="18"/>
+          <w:szCs w:val="18"/>
+          <w:lang w:val="en-US"/>
+        </w:rPr>
+        <w:t xml:space="preserve"> </w:t>
+      </w:r>
+      <w:r>
+        <w:rPr>
+          <w:rFonts w:ascii="Noto Serif SC" w:eastAsia="Noto Serif SC" w:hAnsi="Noto Serif SC" w:cs="Noto Serif"/>
+          <w:sz w:val="18"/>
+          <w:szCs w:val="18"/>
+        </w:rPr>
+        <w:t>低音锣(小) Tam-tam (</w:t>
       </w:r>
       <w:proofErr w:type="spellStart"/>
       <w:r>
@@ -2737,7 +2859,7 @@
           <w:sz w:val="18"/>
           <w:szCs w:val="18"/>
         </w:rPr>
-        <w:t>Paigu</w:t>
+        <w:t>Sm</w:t>
       </w:r>
       <w:proofErr w:type="spellEnd"/>
       <w:r>
@@ -2746,6 +2868,100 @@
           <w:sz w:val="18"/>
           <w:szCs w:val="18"/>
         </w:rPr>
+        <w:t>)</w:t>
+      </w:r>
+      <w:r>
+        <w:rPr>
+          <w:rFonts w:ascii="Noto Serif SC" w:eastAsia="Noto Serif SC" w:hAnsi="Noto Serif SC" w:cs="Noto Serif"/>
+          <w:sz w:val="18"/>
+          <w:szCs w:val="18"/>
+        </w:rPr>
+        <w:t xml:space="preserve">, </w:t>
+      </w:r>
+      <w:r>
+        <w:rPr>
+          <w:rFonts w:ascii="Noto Serif SC" w:eastAsia="Noto Serif SC" w:hAnsi="Noto Serif SC" w:cs="Noto Serif"/>
+          <w:sz w:val="18"/>
+          <w:szCs w:val="18"/>
+        </w:rPr>
+        <w:t>中国颂钵(小) Chinese Singing Bowl (</w:t>
+      </w:r>
+      <w:proofErr w:type="spellStart"/>
+      <w:r>
+        <w:rPr>
+          <w:rFonts w:ascii="Noto Serif SC" w:eastAsia="Noto Serif SC" w:hAnsi="Noto Serif SC" w:cs="Noto Serif"/>
+          <w:sz w:val="18"/>
+          <w:szCs w:val="18"/>
+        </w:rPr>
+        <w:t>Sm</w:t>
+      </w:r>
+      <w:proofErr w:type="spellEnd"/>
+      <w:r>
+        <w:rPr>
+          <w:rFonts w:ascii="Noto Serif SC" w:eastAsia="Noto Serif SC" w:hAnsi="Noto Serif SC" w:cs="Noto Serif"/>
+          <w:sz w:val="18"/>
+          <w:szCs w:val="18"/>
+        </w:rPr>
+        <w:t>)</w:t>
+      </w:r>
+      <w:r>
+        <w:rPr>
+          <w:rFonts w:ascii="Noto Serif SC" w:eastAsia="Noto Serif SC" w:hAnsi="Noto Serif SC" w:cs="Noto Serif"/>
+          <w:sz w:val="18"/>
+          <w:szCs w:val="18"/>
+        </w:rPr>
+        <w:t xml:space="preserve">, </w:t>
+      </w:r>
+      <w:r>
+        <w:rPr>
+          <w:rFonts w:ascii="Noto Serif SC" w:eastAsia="Noto Serif SC" w:hAnsi="Noto Serif SC" w:cs="Noto Serif"/>
+          <w:sz w:val="18"/>
+          <w:szCs w:val="18"/>
+        </w:rPr>
+        <w:t>小钹 Xiaobo</w:t>
+      </w:r>
+      <w:r>
+        <w:rPr>
+          <w:rFonts w:ascii="Noto Serif SC" w:eastAsia="Noto Serif SC" w:hAnsi="Noto Serif SC" w:cs="Noto Serif"/>
+          <w:sz w:val="18"/>
+          <w:szCs w:val="18"/>
+        </w:rPr>
+        <w:t xml:space="preserve">, </w:t>
+      </w:r>
+      <w:r>
+        <w:rPr>
+          <w:rFonts w:ascii="Noto Serif SC" w:eastAsia="Noto Serif SC" w:hAnsi="Noto Serif SC" w:cs="Noto Serif"/>
+          <w:sz w:val="18"/>
+          <w:szCs w:val="18"/>
+        </w:rPr>
+        <w:t>雷板 Thunder Sheet</w:t>
+      </w:r>
+    </w:p>
+    <w:p>
+      <w:pPr>
+        <w:ind w:left="720" w:hanging="436"/>
+        <w:rPr>
+          <w:rFonts w:ascii="Noto Serif SC" w:eastAsia="Noto Serif SC" w:hAnsi="Noto Serif SC" w:cs="Noto Serif"/>
+          <w:sz w:val="18"/>
+          <w:szCs w:val="18"/>
+        </w:rPr>
+      </w:pPr>
+      <w:r>
+        <w:rPr>
+          <w:rFonts w:ascii="Noto Serif SC" w:eastAsia="Noto Serif SC" w:hAnsi="Noto Serif SC" w:cs="Noto Serif"/>
+          <w:sz w:val="18"/>
+          <w:szCs w:val="18"/>
+          <w:lang w:val="en-US"/>
+        </w:rPr>
+        <w:t>III:</w:t>
+      </w:r>
+      <w:r>
+        <w:rPr>
+          <w:rFonts w:ascii="Noto Serif SC" w:eastAsia="Noto Serif SC" w:hAnsi="Noto Serif SC" w:cs="Noto Serif"/>
+          <w:sz w:val="18"/>
+          <w:szCs w:val="18"/>
+          <w:lang w:val="en-US"/>
+        </w:rPr>
         <w:t xml:space="preserve"> </w:t>
       </w:r>
       <w:r>
@@ -2754,6 +2970,14 @@
           <w:sz w:val="18"/>
           <w:szCs w:val="18"/>
         </w:rPr>
+        <w:t>中国颂钵(中) Chinese Singing Bowl (Med)</w:t>
+      </w:r>
+      <w:r>
+        <w:rPr>
+          <w:rFonts w:ascii="Noto Serif SC" w:eastAsia="Noto Serif SC" w:hAnsi="Noto Serif SC" w:cs="Noto Serif"/>
+          <w:sz w:val="18"/>
+          <w:szCs w:val="18"/>
+        </w:rPr>
         <w:t xml:space="preserve">, </w:t>
       </w:r>
       <w:r>
@@ -2762,15 +2986,123 @@
           <w:sz w:val="18"/>
           <w:szCs w:val="18"/>
         </w:rPr>
-        <w:t>小钟琴 Glockenspiel</w:t>
-      </w:r>
-      <w:r>
-        <w:rPr>
-          <w:rFonts w:ascii="Noto Serif SC" w:eastAsia="Noto Serif SC" w:hAnsi="Noto Serif SC" w:cs="Noto Serif"/>
-          <w:sz w:val="18"/>
-          <w:szCs w:val="18"/>
-        </w:rPr>
-        <w:t xml:space="preserve">, 大锣 </w:t>
+        <w:t>低音锣(中) Tam-tam (Med)</w:t>
+      </w:r>
+      <w:r>
+        <w:rPr>
+          <w:rFonts w:ascii="Noto Serif SC" w:eastAsia="Noto Serif SC" w:hAnsi="Noto Serif SC" w:cs="Noto Serif"/>
+          <w:sz w:val="18"/>
+          <w:szCs w:val="18"/>
+        </w:rPr>
+        <w:t xml:space="preserve">, </w:t>
+      </w:r>
+      <w:r>
+        <w:rPr>
+          <w:rFonts w:ascii="Noto Serif SC" w:eastAsia="Noto Serif SC" w:hAnsi="Noto Serif SC" w:cs="Noto Serif"/>
+          <w:sz w:val="18"/>
+          <w:szCs w:val="18"/>
+        </w:rPr>
+        <w:t>风铃 (竹) Bamboo Chimes</w:t>
+      </w:r>
+      <w:r>
+        <w:rPr>
+          <w:rFonts w:ascii="Noto Serif SC" w:eastAsia="Noto Serif SC" w:hAnsi="Noto Serif SC" w:cs="Noto Serif"/>
+          <w:sz w:val="18"/>
+          <w:szCs w:val="18"/>
+        </w:rPr>
+        <w:t xml:space="preserve">, </w:t>
+      </w:r>
+      <w:r>
+        <w:rPr>
+          <w:rFonts w:ascii="Noto Serif SC" w:eastAsia="Noto Serif SC" w:hAnsi="Noto Serif SC" w:cs="Noto Serif"/>
+          <w:sz w:val="18"/>
+          <w:szCs w:val="18"/>
+        </w:rPr>
+        <w:t>风铃 (金属) Metal Chimes</w:t>
+      </w:r>
+      <w:r>
+        <w:rPr>
+          <w:rFonts w:ascii="Noto Serif SC" w:eastAsia="Noto Serif SC" w:hAnsi="Noto Serif SC" w:cs="Noto Serif"/>
+          <w:sz w:val="18"/>
+          <w:szCs w:val="18"/>
+        </w:rPr>
+        <w:t xml:space="preserve">, </w:t>
+      </w:r>
+      <w:r>
+        <w:rPr>
+          <w:rFonts w:ascii="Noto Serif SC" w:eastAsia="Noto Serif SC" w:hAnsi="Noto Serif SC" w:cs="Noto Serif"/>
+          <w:sz w:val="18"/>
+          <w:szCs w:val="18"/>
+        </w:rPr>
+        <w:t>定音鼓 Timpani</w:t>
+      </w:r>
+      <w:r>
+        <w:rPr>
+          <w:rFonts w:ascii="Noto Serif SC" w:eastAsia="Noto Serif SC" w:hAnsi="Noto Serif SC" w:cs="Noto Serif"/>
+          <w:sz w:val="18"/>
+          <w:szCs w:val="18"/>
+        </w:rPr>
+        <w:t xml:space="preserve">, </w:t>
+      </w:r>
+      <w:r>
+        <w:rPr>
+          <w:rFonts w:ascii="Noto Serif SC" w:eastAsia="Noto Serif SC" w:hAnsi="Noto Serif SC" w:cs="Noto Serif"/>
+          <w:sz w:val="18"/>
+          <w:szCs w:val="18"/>
+        </w:rPr>
+        <w:t>大钹 Dabo</w:t>
+      </w:r>
+      <w:r>
+        <w:rPr>
+          <w:rFonts w:ascii="Noto Serif SC" w:eastAsia="Noto Serif SC" w:hAnsi="Noto Serif SC" w:cs="Noto Serif"/>
+          <w:sz w:val="18"/>
+          <w:szCs w:val="18"/>
+        </w:rPr>
+        <w:t xml:space="preserve">, </w:t>
+      </w:r>
+      <w:r>
+        <w:rPr>
+          <w:rFonts w:ascii="Noto Serif SC" w:eastAsia="Noto Serif SC" w:hAnsi="Noto Serif SC" w:cs="Noto Serif"/>
+          <w:sz w:val="18"/>
+          <w:szCs w:val="18"/>
+        </w:rPr>
+        <w:t>弹音器 Flexatone</w:t>
+      </w:r>
+    </w:p>
+    <w:p>
+      <w:pPr>
+        <w:ind w:left="720" w:hanging="436"/>
+        <w:rPr>
+          <w:rFonts w:ascii="Noto Serif SC" w:eastAsia="Noto Serif SC" w:hAnsi="Noto Serif SC" w:cs="Noto Serif"/>
+          <w:sz w:val="18"/>
+          <w:szCs w:val="18"/>
+        </w:rPr>
+      </w:pPr>
+      <w:r>
+        <w:rPr>
+          <w:rFonts w:ascii="Noto Serif SC" w:eastAsia="Noto Serif SC" w:hAnsi="Noto Serif SC" w:cs="Noto Serif"/>
+          <w:sz w:val="18"/>
+          <w:szCs w:val="18"/>
+          <w:lang w:val="en-GB"/>
+        </w:rPr>
+        <w:t>IV:</w:t>
+      </w:r>
+      <w:r>
+        <w:rPr>
+          <w:rFonts w:ascii="Noto Serif SC" w:eastAsia="Noto Serif SC" w:hAnsi="Noto Serif SC" w:cs="Noto Serif"/>
+          <w:sz w:val="18"/>
+          <w:szCs w:val="18"/>
+          <w:lang w:val="en-GB"/>
+        </w:rPr>
+        <w:t xml:space="preserve"> </w:t>
+      </w:r>
+      <w:r>
+        <w:rPr>
+          <w:rFonts w:ascii="Noto Serif SC" w:eastAsia="Noto Serif SC" w:hAnsi="Noto Serif SC" w:cs="Noto Serif"/>
+          <w:sz w:val="18"/>
+          <w:szCs w:val="18"/>
+        </w:rPr>
+        <w:t>中国颂钵(大) Chinese Singing Bowl (</w:t>
       </w:r>
       <w:proofErr w:type="spellStart"/>
       <w:r>
@@ -2779,35 +3111,32 @@
           <w:sz w:val="18"/>
           <w:szCs w:val="18"/>
         </w:rPr>
-        <w:t>Daluo</w:t>
+        <w:t>Lg</w:t>
       </w:r>
       <w:proofErr w:type="spellEnd"/>
-    </w:p>
-    <w:p>
-      <w:pPr>
-        <w:ind w:left="720" w:hanging="436"/>
-        <w:rPr>
-          <w:rFonts w:ascii="Noto Serif SC" w:eastAsia="Noto Serif SC" w:hAnsi="Noto Serif SC" w:cs="Noto Serif"/>
-          <w:sz w:val="18"/>
-          <w:szCs w:val="18"/>
-        </w:rPr>
-      </w:pPr>
-      <w:r>
-        <w:rPr>
-          <w:rFonts w:ascii="Noto Serif SC" w:eastAsia="Noto Serif SC" w:hAnsi="Noto Serif SC" w:cs="Noto Serif"/>
-          <w:sz w:val="18"/>
-          <w:szCs w:val="18"/>
-          <w:lang w:val="en-US"/>
-        </w:rPr>
-        <w:t xml:space="preserve">III: </w:t>
-      </w:r>
-      <w:r>
-        <w:rPr>
-          <w:rFonts w:ascii="Noto Serif SC" w:eastAsia="Noto Serif SC" w:hAnsi="Noto Serif SC" w:cs="Noto Serif"/>
-          <w:sz w:val="18"/>
-          <w:szCs w:val="18"/>
-        </w:rPr>
-        <w:t xml:space="preserve">大锣 </w:t>
+      <w:r>
+        <w:rPr>
+          <w:rFonts w:ascii="Noto Serif SC" w:eastAsia="Noto Serif SC" w:hAnsi="Noto Serif SC" w:cs="Noto Serif"/>
+          <w:sz w:val="18"/>
+          <w:szCs w:val="18"/>
+        </w:rPr>
+        <w:t>)</w:t>
+      </w:r>
+      <w:r>
+        <w:rPr>
+          <w:rFonts w:ascii="Noto Serif SC" w:eastAsia="Noto Serif SC" w:hAnsi="Noto Serif SC" w:cs="Noto Serif"/>
+          <w:sz w:val="18"/>
+          <w:szCs w:val="18"/>
+        </w:rPr>
+        <w:t xml:space="preserve"> </w:t>
+      </w:r>
+      <w:r>
+        <w:rPr>
+          <w:rFonts w:ascii="Noto Serif SC" w:eastAsia="Noto Serif SC" w:hAnsi="Noto Serif SC" w:cs="Noto Serif"/>
+          <w:sz w:val="18"/>
+          <w:szCs w:val="18"/>
+        </w:rPr>
+        <w:t>低音锣(大) Tam-tam (</w:t>
       </w:r>
       <w:proofErr w:type="spellStart"/>
       <w:r>
@@ -2816,7 +3145,7 @@
           <w:sz w:val="18"/>
           <w:szCs w:val="18"/>
         </w:rPr>
-        <w:t>Daluo</w:t>
+        <w:t>Lg</w:t>
       </w:r>
       <w:proofErr w:type="spellEnd"/>
       <w:r>
@@ -2825,7 +3154,23 @@
           <w:sz w:val="18"/>
           <w:szCs w:val="18"/>
         </w:rPr>
-        <w:t xml:space="preserve">, 梆子 </w:t>
+        <w:t>)</w:t>
+      </w:r>
+      <w:r>
+        <w:rPr>
+          <w:rFonts w:ascii="Noto Serif SC" w:eastAsia="Noto Serif SC" w:hAnsi="Noto Serif SC" w:cs="Noto Serif"/>
+          <w:sz w:val="18"/>
+          <w:szCs w:val="18"/>
+        </w:rPr>
+        <w:t xml:space="preserve">, </w:t>
+      </w:r>
+      <w:r>
+        <w:rPr>
+          <w:rFonts w:ascii="Noto Serif SC" w:eastAsia="Noto Serif SC" w:hAnsi="Noto Serif SC" w:cs="Noto Serif"/>
+          <w:sz w:val="18"/>
+          <w:szCs w:val="18"/>
+        </w:rPr>
+        <w:t xml:space="preserve">花盤鼓 </w:t>
       </w:r>
       <w:proofErr w:type="spellStart"/>
       <w:r>
@@ -2834,7 +3179,7 @@
           <w:sz w:val="18"/>
           <w:szCs w:val="18"/>
         </w:rPr>
-        <w:t>Bangzi</w:t>
+        <w:t>Huapengu</w:t>
       </w:r>
       <w:proofErr w:type="spellEnd"/>
       <w:r>
@@ -2843,80 +3188,31 @@
           <w:sz w:val="18"/>
           <w:szCs w:val="18"/>
         </w:rPr>
-        <w:t>, 颤音琴 Vibraphone</w:t>
-      </w:r>
-    </w:p>
-    <w:p>
-      <w:pPr>
-        <w:ind w:left="720" w:hanging="436"/>
-        <w:rPr>
-          <w:rFonts w:ascii="Noto Serif SC" w:eastAsia="Noto Serif SC" w:hAnsi="Noto Serif SC" w:cs="Noto Serif"/>
-          <w:sz w:val="18"/>
-          <w:szCs w:val="18"/>
-        </w:rPr>
-      </w:pPr>
-      <w:r>
-        <w:rPr>
-          <w:rFonts w:ascii="Noto Serif SC" w:eastAsia="Noto Serif SC" w:hAnsi="Noto Serif SC" w:cs="Noto Serif"/>
-          <w:sz w:val="18"/>
-          <w:szCs w:val="18"/>
-          <w:lang w:val="en-GB"/>
-        </w:rPr>
-        <w:t xml:space="preserve">IV: </w:t>
-      </w:r>
-      <w:r>
-        <w:rPr>
-          <w:rFonts w:ascii="Noto Serif SC" w:eastAsia="Noto Serif SC" w:hAnsi="Noto Serif SC" w:cs="Noto Serif"/>
-          <w:sz w:val="18"/>
-          <w:szCs w:val="18"/>
-        </w:rPr>
-        <w:t>铃鼓 Tambourine, 吊镲 Suspended Cymbal</w:t>
-      </w:r>
-    </w:p>
-    <w:p>
-      <w:pPr>
-        <w:ind w:left="720" w:hanging="436"/>
-        <w:rPr>
-          <w:rFonts w:ascii="Noto Serif SC" w:eastAsia="Noto Serif SC" w:hAnsi="Noto Serif SC" w:cs="Noto Serif"/>
-          <w:sz w:val="18"/>
-          <w:szCs w:val="18"/>
-          <w:lang w:val="en-US"/>
-        </w:rPr>
-      </w:pPr>
-      <w:r>
-        <w:rPr>
-          <w:rFonts w:ascii="Noto Serif SC" w:eastAsia="Noto Serif SC" w:hAnsi="Noto Serif SC" w:cs="Noto Serif"/>
-          <w:sz w:val="18"/>
-          <w:szCs w:val="18"/>
-          <w:lang w:val="en-US"/>
-        </w:rPr>
-        <w:t xml:space="preserve">V: </w:t>
-      </w:r>
-      <w:r>
-        <w:rPr>
-          <w:rFonts w:ascii="Noto Serif SC" w:eastAsia="Noto Serif SC" w:hAnsi="Noto Serif SC" w:cs="Noto Serif"/>
-          <w:sz w:val="18"/>
-          <w:szCs w:val="18"/>
-        </w:rPr>
-        <w:t xml:space="preserve">小镲 </w:t>
-      </w:r>
-      <w:proofErr w:type="spellStart"/>
-      <w:r>
-        <w:rPr>
-          <w:rFonts w:ascii="Noto Serif SC" w:eastAsia="Noto Serif SC" w:hAnsi="Noto Serif SC" w:cs="Noto Serif"/>
-          <w:sz w:val="18"/>
-          <w:szCs w:val="18"/>
-        </w:rPr>
-        <w:t>Xiaocha</w:t>
-      </w:r>
-      <w:proofErr w:type="spellEnd"/>
-      <w:r>
-        <w:rPr>
-          <w:rFonts w:ascii="Noto Serif SC" w:eastAsia="Noto Serif SC" w:hAnsi="Noto Serif SC" w:cs="Noto Serif"/>
-          <w:sz w:val="18"/>
-          <w:szCs w:val="18"/>
-        </w:rPr>
-        <w:t>, 三角铁 Triangle, 大钹 Dabo</w:t>
+        <w:t xml:space="preserve">, </w:t>
+      </w:r>
+      <w:r>
+        <w:rPr>
+          <w:rFonts w:ascii="Noto Serif SC" w:eastAsia="Noto Serif SC" w:hAnsi="Noto Serif SC" w:cs="Noto Serif"/>
+          <w:sz w:val="18"/>
+          <w:szCs w:val="18"/>
+        </w:rPr>
+        <w:t>板鼓 Bangu</w:t>
+      </w:r>
+      <w:r>
+        <w:rPr>
+          <w:rFonts w:ascii="Noto Serif SC" w:eastAsia="Noto Serif SC" w:hAnsi="Noto Serif SC" w:cs="Noto Serif"/>
+          <w:sz w:val="18"/>
+          <w:szCs w:val="18"/>
+        </w:rPr>
+        <w:t xml:space="preserve">, </w:t>
+      </w:r>
+      <w:r>
+        <w:rPr>
+          <w:rFonts w:ascii="Noto Serif SC" w:eastAsia="Noto Serif SC" w:hAnsi="Noto Serif SC" w:cs="Noto Serif"/>
+          <w:sz w:val="18"/>
+          <w:szCs w:val="18"/>
+        </w:rPr>
+        <w:t>铙钹 Crotales</w:t>
       </w:r>
     </w:p>
     <w:p>

</xml_diff>